<commit_message>
Add PDF version of report
Upload PDF version of the report in order to make
it viewable even if partially incomplete (missing
data science analysis)
</commit_message>
<xml_diff>
--- a/wip-report/report-teoria-portafoglio.docx
+++ b/wip-report/report-teoria-portafoglio.docx
@@ -135,8 +135,48 @@
           <w:szCs w:val="50"/>
           <w:lang w:val="it-IT"/>
         </w:rPr>
-        <w:t>Université de la Vallée d’Aoste</w:t>
-      </w:r>
+        <w:t xml:space="preserve">Université de la </w:t>
+      </w:r>
+      <w:proofErr w:type="spellStart"/>
+      <w:r>
+        <w:rPr>
+          <w:rFonts w:asciiTheme="majorHAnsi" w:hAnsiTheme="majorHAnsi"/>
+          <w:b/>
+          <w:bCs/>
+          <w:color w:val="77206D" w:themeColor="accent5" w:themeShade="BF"/>
+          <w:sz w:val="50"/>
+          <w:szCs w:val="50"/>
+          <w:lang w:val="it-IT"/>
+        </w:rPr>
+        <w:t>Vallée</w:t>
+      </w:r>
+      <w:proofErr w:type="spellEnd"/>
+      <w:r>
+        <w:rPr>
+          <w:rFonts w:asciiTheme="majorHAnsi" w:hAnsiTheme="majorHAnsi"/>
+          <w:b/>
+          <w:bCs/>
+          <w:color w:val="77206D" w:themeColor="accent5" w:themeShade="BF"/>
+          <w:sz w:val="50"/>
+          <w:szCs w:val="50"/>
+          <w:lang w:val="it-IT"/>
+        </w:rPr>
+        <w:t xml:space="preserve"> d’</w:t>
+      </w:r>
+      <w:proofErr w:type="spellStart"/>
+      <w:r>
+        <w:rPr>
+          <w:rFonts w:asciiTheme="majorHAnsi" w:hAnsiTheme="majorHAnsi"/>
+          <w:b/>
+          <w:bCs/>
+          <w:color w:val="77206D" w:themeColor="accent5" w:themeShade="BF"/>
+          <w:sz w:val="50"/>
+          <w:szCs w:val="50"/>
+          <w:lang w:val="it-IT"/>
+        </w:rPr>
+        <w:t>Aoste</w:t>
+      </w:r>
+      <w:proofErr w:type="spellEnd"/>
     </w:p>
     <w:p>
       <w:pPr>
@@ -2861,6 +2901,7 @@
                 <w:lang w:val="it-IT"/>
               </w:rPr>
             </w:pPr>
+            <w:proofErr w:type="spellStart"/>
             <w:r>
               <w:rPr>
                 <w:i/>
@@ -2878,6 +2919,7 @@
               </w:rPr>
               <w:t>xi</w:t>
             </w:r>
+            <w:proofErr w:type="spellEnd"/>
             <w:r>
               <w:rPr>
                 <w:i/>
@@ -3058,7 +3100,16 @@
                 <w:iCs/>
                 <w:lang w:val="it-IT"/>
               </w:rPr>
-              <w:t>, x</w:t>
+              <w:t xml:space="preserve">, </w:t>
+            </w:r>
+            <w:proofErr w:type="spellStart"/>
+            <w:r>
+              <w:rPr>
+                <w:i/>
+                <w:iCs/>
+                <w:lang w:val="it-IT"/>
+              </w:rPr>
+              <w:t>x</w:t>
             </w:r>
             <w:r>
               <w:rPr>
@@ -3069,6 +3120,7 @@
               </w:rPr>
               <w:t>j</w:t>
             </w:r>
+            <w:proofErr w:type="spellEnd"/>
           </w:p>
           <w:p>
             <w:pPr>
@@ -3155,7 +3207,16 @@
                 <w:iCs/>
                 <w:lang w:val="it-IT"/>
               </w:rPr>
-              <w:t>, x</w:t>
+              <w:t xml:space="preserve">, </w:t>
+            </w:r>
+            <w:proofErr w:type="spellStart"/>
+            <w:r>
+              <w:rPr>
+                <w:i/>
+                <w:iCs/>
+                <w:lang w:val="it-IT"/>
+              </w:rPr>
+              <w:t>x</w:t>
             </w:r>
             <w:r>
               <w:rPr>
@@ -3166,6 +3227,7 @@
               </w:rPr>
               <w:t>j</w:t>
             </w:r>
+            <w:proofErr w:type="spellEnd"/>
           </w:p>
         </w:tc>
         <w:tc>
@@ -3301,7 +3363,14 @@
                       <w:rFonts w:ascii="Cambria Math" w:hAnsi="Cambria Math"/>
                       <w:lang w:val="it-IT"/>
                     </w:rPr>
-                    <m:t>i=1</m:t>
+                    <m:t>i</m:t>
+                  </m:r>
+                  <m:r>
+                    <w:rPr>
+                      <w:rFonts w:ascii="Cambria Math" w:hAnsi="Cambria Math"/>
+                      <w:lang w:val="it-IT"/>
+                    </w:rPr>
+                    <m:t>=1</m:t>
                   </m:r>
                 </m:sub>
                 <m:sup>
@@ -3324,6 +3393,7 @@
                 </m:e>
               </m:nary>
             </m:oMath>
+            <w:proofErr w:type="spellStart"/>
             <w:r>
               <w:rPr>
                 <w:i/>
@@ -3354,6 +3424,7 @@
               </w:rPr>
               <w:t>i</w:t>
             </w:r>
+            <w:proofErr w:type="spellEnd"/>
             <w:r>
               <w:rPr>
                 <w:i/>
@@ -3416,7 +3487,14 @@
                       <w:rFonts w:ascii="Cambria Math" w:hAnsi="Cambria Math"/>
                       <w:lang w:val="it-IT"/>
                     </w:rPr>
-                    <m:t>i=1</m:t>
+                    <m:t>i</m:t>
+                  </m:r>
+                  <m:r>
+                    <w:rPr>
+                      <w:rFonts w:ascii="Cambria Math" w:hAnsi="Cambria Math"/>
+                      <w:lang w:val="it-IT"/>
+                    </w:rPr>
+                    <m:t>=1</m:t>
                   </m:r>
                 </m:sub>
                 <m:sup>
@@ -3965,6 +4043,7 @@
                 <w:lang w:val="it-IT"/>
               </w:rPr>
             </w:pPr>
+            <w:proofErr w:type="spellStart"/>
             <w:r>
               <w:rPr>
                 <w:lang w:val="it-IT"/>
@@ -3978,6 +4057,7 @@
               </w:rPr>
               <w:t>t</w:t>
             </w:r>
+            <w:proofErr w:type="spellEnd"/>
             <w:r>
               <w:rPr>
                 <w:lang w:val="it-IT"/>
@@ -8326,7 +8406,21 @@
         <w:rPr>
           <w:lang w:val="it-IT"/>
         </w:rPr>
-        <w:t>, che presenta un rischio superiore del portafoglio defense e una rendita minore di circa 5 punti percentuali.</w:t>
+        <w:t xml:space="preserve">, che presenta un rischio superiore del portafoglio defense e una rendita minore di circa </w:t>
+      </w:r>
+      <w:proofErr w:type="gramStart"/>
+      <w:r>
+        <w:rPr>
+          <w:lang w:val="it-IT"/>
+        </w:rPr>
+        <w:t>5</w:t>
+      </w:r>
+      <w:proofErr w:type="gramEnd"/>
+      <w:r>
+        <w:rPr>
+          <w:lang w:val="it-IT"/>
+        </w:rPr>
+        <w:t xml:space="preserve"> punti percentuali.</w:t>
       </w:r>
     </w:p>
     <w:p>
@@ -10496,6 +10590,7 @@
         </w:rPr>
         <w:t xml:space="preserve"> titoli ha comportato un’</w:t>
       </w:r>
+      <w:proofErr w:type="spellStart"/>
       <w:r>
         <w:rPr>
           <w:i/>
@@ -10520,6 +10615,7 @@
         </w:rPr>
         <w:t>mance</w:t>
       </w:r>
+      <w:proofErr w:type="spellEnd"/>
       <w:r>
         <w:rPr>
           <w:lang w:val="it-IT"/>
@@ -11145,6 +11241,7 @@
         <w:docPartUnique/>
       </w:docPartObj>
     </w:sdtPr>
+    <w:sdtEndPr/>
     <w:sdtContent>
       <w:p>
         <w:pPr>
@@ -11203,6 +11300,7 @@
         <w:docPartUnique/>
       </w:docPartObj>
     </w:sdtPr>
+    <w:sdtEndPr/>
     <w:sdtContent>
       <w:p>
         <w:pPr>
@@ -11431,8 +11529,16 @@
       <w:r>
         <w:t xml:space="preserve"> Fonte dei tickers: </w:t>
       </w:r>
-      <w:r>
-        <w:t xml:space="preserve">https://sg.finance.yahoo.com/markets/stocks/most-active/ </w:t>
+      <w:hyperlink r:id="rId3" w:history="1">
+        <w:r>
+          <w:rPr>
+            <w:rStyle w:val="Hyperlink"/>
+          </w:rPr>
+          <w:t>https://sg.finance.yahoo.com/markets/stocks/most-active/</w:t>
+        </w:r>
+      </w:hyperlink>
+      <w:r>
+        <w:t xml:space="preserve"> </w:t>
       </w:r>
     </w:p>
   </w:footnote>
@@ -11469,7 +11575,7 @@
       <w:r>
         <w:t xml:space="preserve">Fonte: </w:t>
       </w:r>
-      <w:hyperlink r:id="rId3" w:history="1">
+      <w:hyperlink r:id="rId4" w:history="1">
         <w:r>
           <w:rPr>
             <w:rStyle w:val="Hyperlink"/>
@@ -12912,6 +13018,7 @@
   <w:style w:type="character" w:default="1" w:styleId="DefaultParagraphFont">
     <w:name w:val="Default Paragraph Font"/>
     <w:uiPriority w:val="1"/>
+    <w:semiHidden/>
     <w:unhideWhenUsed/>
   </w:style>
   <w:style w:type="table" w:default="1" w:styleId="TableNormal">

</xml_diff>